<commit_message>
Inject Phase 3 text into main.docx
</commit_message>
<xml_diff>
--- a/paper/main.docx
+++ b/paper/main.docx
@@ -11349,6 +11349,29 @@
     <w:bookmarkEnd w:id="79"/>
     <w:bookmarkEnd w:id="80"/>
     <w:bookmarkStart w:id="81" w:name="discussion-and-limitations"/>
+    <w:p>
+      <w:r>
+        <w:t>By finding the nearest safe medians and constructing multiple alternative plans (e.g., increasing VLE engagement vs. focusing purely on assignment submissions), the system acts as a diagnostic tool that prescribes concrete, data-driven learning plans. This approach transforms the early warning system from a passive alarm into an active intervention mechanism.</w:t>
+      </w:r>
+    </w:p>
+    <w:p>
+      <w:r>
+        <w:t>Instead of merely diagnosing an at-risk student, the system generates a set of minimal, achievable changes to their behavioral features that would flip their prediction to a "safe" (Pass) status. A strict ethical constraint is applied during this generation process: demographic and socioeconomic features (e.g., age, gender, region, disability) are rendered immutable. Actionable recourses are restricted exclusively to behavioral interactions within the Virtual Learning Environment (VLE) and assessment submissions.</w:t>
+      </w:r>
+    </w:p>
+    <w:p>
+      <w:r>
+        <w:t>While predictive accuracy (Phase 1) and global/local explanations via SHAP (Phase 2) provide necessary transparency, they stop short of providing actionable guidance for students. To address this, the EduGuard system introduces a third phase: Actionable Recourse based on Diverse Counterfactual Explanations.</w:t>
+      </w:r>
+    </w:p>
+    <w:p>
+      <w:pPr>
+        <w:pStyle w:val="Heading1"/>
+      </w:pPr>
+      <w:r>
+        <w:t>Phase 3: Actionable Recourse via Diverse Counterfactuals</w:t>
+      </w:r>
+    </w:p>
     <w:p>
       <w:pPr>
         <w:pStyle w:val="Heading1"/>

</xml_diff>